<commit_message>
Adverts, Recruitment page and emails point to the live registration page; accurate data source line in provider emails
Co-Authored-By: Claude Opus 5.5 <noreply@anthropic.com>
Claude-Session: https://claude.ai/code/session_01XByJMQfkaq2do2XmLu4Dhj
</commit_message>
<xml_diff>
--- a/documents/Haverton Recruitment/7 Launch Kit/Job Adverts.docx
+++ b/documents/Haverton Recruitment/7 Launch Kit/Job Adverts.docx
@@ -866,6 +866,21 @@
                 <w:b/>
                 <w:bCs/>
               </w:rPr>
+              <w:t xml:space="preserve">Your registration page</w:t>
+            </w:r>
+            <w:r>
+              <w:t xml:space="preserve">: operation.havertoncare.co.uk/apply (add ?src=facebook, ?src=linkedin and so on to see which channel works).</w:t>
+            </w:r>
+          </w:p>
+          <w:p>
+            <w:pPr>
+              <w:spacing w:after="60" w:line="280"/>
+            </w:pPr>
+            <w:r>
+              <w:rPr>
+                <w:b/>
+                <w:bCs/>
+              </w:rPr>
               <w:t xml:space="preserve">Your website Recruitment page</w:t>
             </w:r>
             <w:r>
@@ -1171,7 +1186,17 @@
         <w:spacing w:after="140" w:line="300"/>
       </w:pPr>
       <w:r>
-        <w:t xml:space="preserve">Email your CV to </w:t>
+        <w:t xml:space="preserve">Register and upload your CV in 3 minutes at </w:t>
+      </w:r>
+      <w:r>
+        <w:rPr>
+          <w:b/>
+          <w:bCs/>
+        </w:rPr>
+        <w:t xml:space="preserve">operation.havertoncare.co.uk/apply</w:t>
+      </w:r>
+      <w:r>
+        <w:t xml:space="preserve">, or email </w:t>
       </w:r>
       <w:r>
         <w:rPr>
@@ -1216,7 +1241,7 @@
         <w:t xml:space="preserve">We never charge candidates a fee.</w:t>
       </w:r>
       <w:r>
-        <w:t xml:space="preserve"> We only send your CV to an employer after you have agreed to that specific role. Read how we use your information at havertoncare.co.uk [confirm privacy notice link].</w:t>
+        <w:t xml:space="preserve"> We only send your CV to an employer after you have agreed to that specific role. Read how we use your information at operation.havertoncare.co.uk/apply/privacy.html.</w:t>
       </w:r>
     </w:p>
     <w:p>
@@ -1384,7 +1409,17 @@
         <w:spacing w:after="140" w:line="300"/>
       </w:pPr>
       <w:r>
-        <w:t xml:space="preserve">Email your CV to </w:t>
+        <w:t xml:space="preserve">Register and upload your CV in 3 minutes at </w:t>
+      </w:r>
+      <w:r>
+        <w:rPr>
+          <w:b/>
+          <w:bCs/>
+        </w:rPr>
+        <w:t xml:space="preserve">operation.havertoncare.co.uk/apply</w:t>
+      </w:r>
+      <w:r>
+        <w:t xml:space="preserve">, or email </w:t>
       </w:r>
       <w:r>
         <w:rPr>
@@ -1429,7 +1464,7 @@
         <w:t xml:space="preserve">We never charge candidates a fee.</w:t>
       </w:r>
       <w:r>
-        <w:t xml:space="preserve"> We only send your CV to an employer after you have agreed to that specific role. Read how we use your information at havertoncare.co.uk [confirm privacy notice link].</w:t>
+        <w:t xml:space="preserve"> We only send your CV to an employer after you have agreed to that specific role. Read how we use your information at operation.havertoncare.co.uk/apply/privacy.html.</w:t>
       </w:r>
     </w:p>
     <w:p>
@@ -1597,7 +1632,17 @@
         <w:spacing w:after="140" w:line="300"/>
       </w:pPr>
       <w:r>
-        <w:t xml:space="preserve">Email your CV to </w:t>
+        <w:t xml:space="preserve">Register and upload your CV in 3 minutes at </w:t>
+      </w:r>
+      <w:r>
+        <w:rPr>
+          <w:b/>
+          <w:bCs/>
+        </w:rPr>
+        <w:t xml:space="preserve">operation.havertoncare.co.uk/apply</w:t>
+      </w:r>
+      <w:r>
+        <w:t xml:space="preserve">, or email </w:t>
       </w:r>
       <w:r>
         <w:rPr>
@@ -1642,7 +1687,7 @@
         <w:t xml:space="preserve">We never charge candidates a fee.</w:t>
       </w:r>
       <w:r>
-        <w:t xml:space="preserve"> We only send your CV to an employer after you have agreed to that specific role. Read how we use your information at havertoncare.co.uk [confirm privacy notice link].</w:t>
+        <w:t xml:space="preserve"> We only send your CV to an employer after you have agreed to that specific role. Read how we use your information at operation.havertoncare.co.uk/apply/privacy.html.</w:t>
       </w:r>
     </w:p>
     <w:p>
@@ -1872,7 +1917,17 @@
         <w:spacing w:after="140" w:line="300"/>
       </w:pPr>
       <w:r>
-        <w:t xml:space="preserve">Email your CV to </w:t>
+        <w:t xml:space="preserve">Register and upload your CV in 3 minutes at </w:t>
+      </w:r>
+      <w:r>
+        <w:rPr>
+          <w:b/>
+          <w:bCs/>
+        </w:rPr>
+        <w:t xml:space="preserve">operation.havertoncare.co.uk/apply</w:t>
+      </w:r>
+      <w:r>
+        <w:t xml:space="preserve">, or email </w:t>
       </w:r>
       <w:r>
         <w:rPr>
@@ -1917,7 +1972,7 @@
         <w:t xml:space="preserve">We never charge candidates a fee.</w:t>
       </w:r>
       <w:r>
-        <w:t xml:space="preserve"> We only send your CV to an employer after you have agreed to that specific role. Read how we use your information at havertoncare.co.uk [confirm privacy notice link].</w:t>
+        <w:t xml:space="preserve"> We only send your CV to an employer after you have agreed to that specific role. Read how we use your information at operation.havertoncare.co.uk/apply/privacy.html.</w:t>
       </w:r>
     </w:p>
     <w:p>
@@ -1994,7 +2049,17 @@
         <w:spacing w:after="140" w:line="300"/>
       </w:pPr>
       <w:r>
-        <w:t xml:space="preserve">Email your CV to </w:t>
+        <w:t xml:space="preserve">Register and upload your CV in 3 minutes at </w:t>
+      </w:r>
+      <w:r>
+        <w:rPr>
+          <w:b/>
+          <w:bCs/>
+        </w:rPr>
+        <w:t xml:space="preserve">operation.havertoncare.co.uk/apply</w:t>
+      </w:r>
+      <w:r>
+        <w:t xml:space="preserve">, or email </w:t>
       </w:r>
       <w:r>
         <w:rPr>
@@ -2039,7 +2104,7 @@
         <w:t xml:space="preserve">We never charge candidates a fee.</w:t>
       </w:r>
       <w:r>
-        <w:t xml:space="preserve"> We only send your CV to an employer after you have agreed to that specific role. Read how we use your information at havertoncare.co.uk [confirm privacy notice link].</w:t>
+        <w:t xml:space="preserve"> We only send your CV to an employer after you have agreed to that specific role. Read how we use your information at operation.havertoncare.co.uk/apply/privacy.html.</w:t>
       </w:r>
     </w:p>
     <w:p>
@@ -2187,7 +2252,7 @@
               <w:spacing w:after="40" w:line="270"/>
             </w:pPr>
             <w:r>
-              <w:t xml:space="preserve">Care Assistants and Support Workers around Swanley, Dartford, Bexley and Bromley looking for permanent work: register with us. This is not a specific vacancy; when an employer gives us a real role that fits, we will tell you, and we only share your CV with your OK. No fees, ever. Email your CV to info@havertoncare.co.uk. Haverton Care Limited (Haverton Recruitment And Staffing), permanent work, employment agency.</w:t>
+              <w:t xml:space="preserve">Care Assistants and Support Workers around Swanley, Dartford, Bexley and Bromley looking for permanent work: register with us. This is not a specific vacancy; when an employer gives us a real role that fits, we will tell you, and we only share your CV with your OK. No fees, ever. Register in 3 minutes: operation.havertoncare.co.uk/apply/?src=facebook. Haverton Care Limited (Haverton Recruitment And Staffing), permanent work, employment agency.</w:t>
             </w:r>
           </w:p>
         </w:tc>
@@ -2244,7 +2309,7 @@
               <w:spacing w:after="40" w:line="270"/>
             </w:pPr>
             <w:r>
-              <w:t xml:space="preserve">Registered Managers and Deputy Managers in Kent and South East London: if you would value a confidential conversation about your next step with someone who has done the job, message me. This is not a specific vacancy; nothing is shared without your agreement. Haverton Care Limited (Haverton Recruitment And Staffing), permanent work, employment agency.</w:t>
+              <w:t xml:space="preserve">Registered Managers and Deputy Managers in Kent and South East London: if you would value a confidential conversation about your next step with someone who has done the job, message me or register confidentially at operation.havertoncare.co.uk/apply/?src=linkedin. This is not a specific vacancy; nothing is shared without your agreement. Haverton Care Limited (Haverton Recruitment And Staffing), permanent work, employment agency.</w:t>
             </w:r>
           </w:p>
         </w:tc>
@@ -2301,7 +2366,7 @@
               <w:spacing w:after="40" w:line="270"/>
             </w:pPr>
             <w:r>
-              <w:t xml:space="preserve">Temporary care work is coming soon. Haverton Recruitment And Staffing is preparing to offer temporary work in Kent, Bexley and Bromley. We are not offering shifts yet; message us to be told first. Haverton Care Limited (Haverton Recruitment And Staffing), temporary work, employment business.</w:t>
+              <w:t xml:space="preserve">Temporary care work is coming soon. Haverton Recruitment And Staffing is preparing to offer temporary work in Kent, Bexley and Bromley. We are not offering shifts yet; register at operation.havertoncare.co.uk/apply/?src=facebook to be told first. Haverton Care Limited (Haverton Recruitment And Staffing), temporary work, employment business.</w:t>
             </w:r>
           </w:p>
         </w:tc>

</xml_diff>